<commit_message>
Stop pointing at TextEdit; send readers to Preview and Pages instead
The START-HERE sheet told the reader to open files in TextEdit, which meant
opening the markdown source and seeing raw syntax. Points at the PDFs for
reading, the .docx in Pages for editing, and Numbers for the CSVs. Notes that
Word is unnecessary since Pages is preinstalled and opens .docx.

Co-Authored-By: Claude Opus 5 <noreply@anthropic.com>
</commit_message>
<xml_diff>
--- a/playbook/editable/1-START-HERE.docx
+++ b/playbook/editable/1-START-HERE.docx
@@ -914,7 +914,68 @@
     <w:p/>
     <w:p>
       <w:r>
-        <w:t>Open any of these in TextEdit. They are plain text files, so edit them whenever something changes.</w:t>
+        <w:rPr>
+          <w:b/>
+        </w:rPr>
+        <w:t>Do not open the playbook sheets in TextEdit.</w:t>
+      </w:r>
+      <w:r>
+        <w:t xml:space="preserve"> They will look like a wall of plain text with symbols everywhere, because that version is written for Claude to read, not for you.</w:t>
+      </w:r>
+    </w:p>
+    <w:p>
+      <w:r>
+        <w:t xml:space="preserve">To read one, open the PDF in </w:t>
+      </w:r>
+      <w:r>
+        <w:rPr>
+          <w:rFonts w:ascii="Menlo" w:hAnsi="Menlo"/>
+        </w:rPr>
+        <w:t>playbook/pdf/</w:t>
+      </w:r>
+      <w:r>
+        <w:t xml:space="preserve">. To type into one, open the Word version in </w:t>
+      </w:r>
+      <w:r>
+        <w:rPr>
+          <w:rFonts w:ascii="Menlo" w:hAnsi="Menlo"/>
+        </w:rPr>
+        <w:t>playbook/editable/</w:t>
+      </w:r>
+      <w:r>
+        <w:t xml:space="preserve"> with </w:t>
+      </w:r>
+      <w:r>
+        <w:rPr>
+          <w:b/>
+        </w:rPr>
+        <w:t>Pages</w:t>
+      </w:r>
+      <w:r>
+        <w:t>. See the section at the bottom of this sheet.</w:t>
+      </w:r>
+    </w:p>
+    <w:p>
+      <w:r>
+        <w:t xml:space="preserve">The </w:t>
+      </w:r>
+      <w:r>
+        <w:rPr>
+          <w:rFonts w:ascii="Menlo" w:hAnsi="Menlo"/>
+        </w:rPr>
+        <w:t>.csv</w:t>
+      </w:r>
+      <w:r>
+        <w:t xml:space="preserve"> files are the exception. Those are spreadsheets, so open them in </w:t>
+      </w:r>
+      <w:r>
+        <w:rPr>
+          <w:b/>
+        </w:rPr>
+        <w:t>Numbers</w:t>
+      </w:r>
+      <w:r>
+        <w:t>, which is also already on the Mac.</w:t>
       </w:r>
     </w:p>
     <w:p>
@@ -1355,7 +1416,7 @@
           </w:tcPr>
           <w:p>
             <w:r>
-              <w:t>For printing and taping up</w:t>
+              <w:t>For reading and printing</w:t>
             </w:r>
           </w:p>
         </w:tc>
@@ -1454,6 +1515,49 @@
       </w:tr>
     </w:tbl>
     <w:p/>
+    <w:p>
+      <w:r>
+        <w:rPr>
+          <w:b/>
+        </w:rPr>
+        <w:t>First time opening one from `editable/`:</w:t>
+      </w:r>
+      <w:r>
+        <w:t xml:space="preserve"> double-click it. If it opens in TextEdit and looks wrong, right-click the file → </w:t>
+      </w:r>
+      <w:r>
+        <w:rPr>
+          <w:b/>
+        </w:rPr>
+        <w:t>Open With</w:t>
+      </w:r>
+      <w:r>
+        <w:t xml:space="preserve"> → </w:t>
+      </w:r>
+      <w:r>
+        <w:rPr>
+          <w:b/>
+        </w:rPr>
+        <w:t>Pages</w:t>
+      </w:r>
+      <w:r>
+        <w:t xml:space="preserve">, then check </w:t>
+      </w:r>
+      <w:r>
+        <w:rPr>
+          <w:b/>
+        </w:rPr>
+        <w:t>Always Open With</w:t>
+      </w:r>
+      <w:r>
+        <w:t xml:space="preserve"> so it remembers.</w:t>
+      </w:r>
+    </w:p>
+    <w:p>
+      <w:r>
+        <w:t>You do not need Microsoft Word. Pages is free, already installed, and opens these fine. If you happen to have Word already, that works too. Either way, print straight from the app when you are done.</w:t>
+      </w:r>
+    </w:p>
     <w:p>
       <w:r>
         <w:rPr>

</xml_diff>